<commit_message>
Fix the Liu et al. reference title to the USENIX camera-ready, polish Chinese wording
</commit_message>
<xml_diff>
--- a/paper/draft_zh.docx
+++ b/paper/draft_zh.docx
@@ -99,7 +99,7 @@
         <w:rPr>
           <w:rFonts w:eastAsia="SimSun"/>
         </w:rPr>
-        <w:t>现有两种做法都不理想。让自由生成文本的大模型来做判断，会带来成本、时延与不受约束的输出空间：模型可以输出任意文本或工具调用，于是一次错误判断就可能被执行成越权调用。反过来，把判断写成静态规则虽然避免了这一风险，却处理不了自然语言中的歧义，网关就只能在两种坏结果之间选择：要么频繁打断用户，要么按浅层匹配选错目标。</w:t>
+        <w:t>现有两种做法都不理想。让自由生成文本的大模型来做判断，会带来成本、时延与不受约束的输出空间：模型可以输出任意文本或工具调用，于是一次错误判断就可能被当成越权调用执行。反过来，把判断写成静态规则虽然避免了这一风险，却处理不了自然语言中的歧义，网关就只能在两种坏结果之间选择：要么频繁打断用户，要么按浅层匹配选错目标。</w:t>
       </w:r>
     </w:p>
     <w:p>
@@ -126,7 +126,7 @@
         <w:rPr>
           <w:rFonts w:eastAsia="SimSun"/>
         </w:rPr>
-        <w:t>一个把类型化判断与确定性执行分离的网关架构，由七个模块构成、受四条不变式约束。判断层只能为发现与路由、同意控制、状态管理三个模块的参数化阈值提供输入；入站认证、身份校验与协议执行保持为密码学与确定性的实现。</w:t>
+        <w:t>一个把类型化判断与确定性执行分离的网关架构，由七个模块构成、受四条不变式约束。判断层只能为发现与路由、同意控制、状态管理三个模块的参数化阈值提供输入；入站认证、身份校验与协议执行仍由密码学与确定性代码实现。</w:t>
       </w:r>
     </w:p>
     <w:p>
@@ -313,7 +313,7 @@
         <w:rPr>
           <w:rFonts w:eastAsia="SimSun"/>
         </w:rPr>
-        <w:t>两类文献解释了外围策略为什么需要拒答与校准。选择性分类的工作形式化了覆盖率与风险之间的权衡，并说明预测器在置信度低时应当能够拒绝作答 [7]；现代神经网络即便准确率很高，也常常校准不良，因此置信度必须被测量而不能被假定 [10]。对抗情形同样重要：提示注入可以改变 LLM 集成应用的工具调用 [9]，间接注入把指令藏在应用检索到的内容里 [15]，而智能体基准显示现有防御仍留有可观的残余风险 [4]。这些结果共同支持一种做法：网关测量选择性风险，同时把授权留在模型之外。</w:t>
+        <w:t>两类文献解释了策略层为什么需要拒答与校准。选择性分类的工作形式化了覆盖率与风险之间的权衡，并说明预测器在置信度低时应当能够拒绝作答 [7]；现代神经网络即便准确率很高，也常常校准不良，因此置信度必须被测量而不能被假定 [10]。对抗情形同样重要：提示注入可以改变 LLM 集成应用的工具调用 [9]，间接注入把指令藏在应用检索到的内容里 [15]，而智能体基准显示现有防御仍留有可观的残余风险 [4]。这些结果共同支持一种做法：网关测量选择性风险，同时把授权留在模型之外。</w:t>
       </w:r>
     </w:p>
     <w:p>
@@ -2432,7 +2432,7 @@
         <w:rPr>
           <w:rFonts w:eastAsia="SimSun"/>
         </w:rPr>
-        <w:t>阈值是策略层面的设置，写在代码里而不是由模型输出：模型既不能设定它，也不能绕过它。低于阈值时，网关执行事先声明的回退：询问用户（J2、J3、J4）、保留基于键的结果并记录告警（J5），或者把该失败当作终态并如实上报（J6）。只有在路由、同意状态与身份校验都已确定之后，才允许升级到文本模型去生成文字表述。设计正面接纳了三种有文献记录的失败模式，而不是把它们当作意外：对选项集无法表示的输入做强制选择、流量分布漂移，以及权威框架式注入；它们分别要求提供强制复核选项、随覆盖率一并报告并持续监控阈值，以及把 J7 限制为顾问信号 [7, 9]。</w:t>
+        <w:t>阈值是策略层面的设置，写在代码里而不是由模型输出：模型既不能设定它，也不能绕过它。低于阈值时，网关执行事先声明的回退：询问用户（J2、J3、J4）、保留基于键的结果并记录告警（J5），或者把该失败当作终态并如实上报（J6）。只有在路由、同意状态与身份校验都已确定之后，才允许升级到文本模型去生成文字表述。设计把三种有文献记录的失败模式当作已知代价，而不是意外：对选项集无法表示的输入做强制选择、流量分布漂移，以及权威框架式注入；它们分别要求提供强制复核选项、随覆盖率一并报告并持续监控阈值，以及把 J7 限制为顾问信号 [7, 9]。</w:t>
       </w:r>
     </w:p>
     <w:p>
@@ -3014,6 +3014,36 @@
           <w:rFonts w:eastAsia="SimSun"/>
         </w:rPr>
         <w:t>判断指标定义如下：</w:t>
+      </w:r>
+    </w:p>
+    <w:p>
+      <w:r>
+        <w:rPr>
+          <w:b/>
+          <w:rFonts w:eastAsia="SimSun"/>
+        </w:rPr>
+        <w:t>准确率</w:t>
+      </w:r>
+      <w:r>
+        <w:rPr>
+          <w:rFonts w:eastAsia="SimSun"/>
+        </w:rPr>
+        <w:t xml:space="preserve"> = 判断正确的条目数 / 全部条目数。</w:t>
+      </w:r>
+    </w:p>
+    <w:p>
+      <w:r>
+        <w:rPr>
+          <w:b/>
+          <w:rFonts w:eastAsia="SimSun"/>
+        </w:rPr>
+        <w:t>Brier 分数</w:t>
+      </w:r>
+      <w:r>
+        <w:rPr>
+          <w:rFonts w:eastAsia="SimSun"/>
+        </w:rPr>
+        <w:t xml:space="preserve"> = 预测概率与真实标签之间差值的均方。</w:t>
       </w:r>
     </w:p>
     <w:p>
@@ -4444,7 +4474,7 @@
         <w:rPr>
           <w:rFonts w:eastAsia="SimSun"/>
         </w:rPr>
-        <w:t>表 6 给出留出集上的指标。类型化形态更准确，Brier 约为自由文本的一半；准确率、Brier 与校准误差上的差距都超出运行之间的波动，而关键词规则只是一个透明的参照。跨阈值的覆盖率–风险曲线，以及同样几行改用构造标签（而非裁定标签）计分的结果，都在产物中。该套件的留出划分里只有 3 条 J7 注入项，不足以给出注入率的上界，因此这个问题改由一套专门的注入压力集测量。</w:t>
+        <w:t>表 6 给出留出集上的指标。类型化形态更准确，Brier 约为自由文本的一半；准确率、Brier 与校准误差上的差距都超出运行之间的波动，而关键词规则只是一个透明的参照。跨阈值的覆盖率–风险曲线，以及同样几行改用构造标签（而非裁定标签）计分的结果，都在产物中。该套件的留出划分里只有 3 条 J7 注入项，因此这个问题改由一套专门的注入压力集测量。</w:t>
       </w:r>
     </w:p>
     <w:p>
@@ -4802,7 +4832,7 @@
         <w:rPr>
           <w:rFonts w:eastAsia="SimSun"/>
         </w:rPr>
-        <w:t>表 7 给出压力集上的两项率。三个条件几乎都找出了全部注入项：两种答案形态在合并的 201 次注入观测中一条未漏，关键词基线漏了 3.0%。但在另一个方向上，三者并没有分开，而且没有一个是安全的：类型化把 56.7% 的近邻良性项判为引导尝试，自由文本为 63.1%，关键词基线为 46.8%，其中类型化与自由文本的区间相互重叠。最不「爱报警」的那个条件，也仍然把约一半的引用型文本判成了攻击。正因如此，这个分数不能单独作决定：它只能为阈值提供参数，究竟询问用户、保留基于键的结果，还是根本不去触及端点，都由策略代码决定。</w:t>
+        <w:t>表 7 给出压力集上的两项率。三个条件几乎都找出了全部注入项：两种答案形态在合并的 201 次注入观测中一条未漏，关键词基线漏了 3.0%。但在另一个方向上，三者并没有分开，而且没有一个是安全的：类型化把 56.7% 的近邻良性项判为引导尝试，自由文本为 63.1%，关键词基线为 46.8%，其中类型化与自由文本的区间相互重叠。最不容易触发报警的那个条件，也仍然把约一半的引用型文本判成了攻击。正因如此，这个分数不能单独作决定：它只能为阈值提供参数，究竟询问用户、保留基于键的结果，还是根本不去触及端点，都由策略代码决定。</w:t>
       </w:r>
     </w:p>
     <w:p>
@@ -5270,7 +5300,7 @@
         <w:rPr>
           <w:rFonts w:eastAsia="SimSun"/>
         </w:rPr>
-        <w:t>Y. Liu 等，Prompt injection attacks and defenses in LLM-integrated applications，第 33 届 USENIX 安全研讨会，2024。</w:t>
+        <w:t>Y. Liu 等，Formalizing and benchmarking prompt injection attacks and defenses，第 33 届 USENIX 安全研讨会（USENIX Security 24），2024。</w:t>
       </w:r>
     </w:p>
     <w:p>

</xml_diff>

<commit_message>
State the gateway's no-abstention behaviour as design, not as a finding (EN/ZH)
</commit_message>
<xml_diff>
--- a/paper/draft_zh.docx
+++ b/paper/draft_zh.docx
@@ -3614,7 +3614,7 @@
         <w:rPr>
           <w:rFonts w:eastAsia="SimSun"/>
         </w:rPr>
-        <w:t>；这里的"组合"只表示推荐了多于一个能力，方案在语义上是否真的覆盖请求并未做裁定。对没有任何受测 Partner 宣传相应能力的请求，路径在三次运行中都没有推荐任何受测 Partner，但在 40 条里都推荐了公共注册中心中的其他智能体，底层索引在 40 条中也有 36 条返回了候选；也就是说，这条路径并不弃答，它给出当下可得的最佳候选，把是否接受交给用户。结构化对照更弱：只读取一次，仅靠发现服务把目标排在第一位的有 40/50，进入前三的有 48/50。逐样例对照这一次读取，两种来源在 42/50 条上一致：回复找到 8 个发现未排首位的目标，且不存在"发现把目标排第一、回复却漏掉"的条目。130 条样例中有 18 条的结局在投递之间发生变化，其中 7 条属于 direct。结果在"推荐"这一层面与 H1 一致。</w:t>
+        <w:t>；这里的"组合"只表示推荐了多于一个能力，方案在语义上是否真的覆盖请求并未做裁定。网关自身不做弃答判定：发现索引返回什么，它就呈现什么，是否接受由用户决定。对没有任何受测 Partner 宣传相应能力的请求，这一设计表现为：三次运行中都没有推荐任何受测 Partner，而索引在 40 条中有 36 条给出了候选，回复也在 40 条中点名了公共注册中心里的其他智能体。结构化对照更弱：只读取一次，仅靠发现服务把目标排在第一位的有 40/50，进入前三的有 48/50。逐样例对照这一次读取，两种来源在 42/50 条上一致：回复找到 8 个发现未排首位的目标，且不存在"发现把目标排第一、回复却漏掉"的条目。130 条样例中有 18 条的结局在投递之间发生变化，其中 7 条属于 direct。结果在"推荐"这一层面与 H1 一致。</w:t>
       </w:r>
     </w:p>
     <w:p>
@@ -4861,7 +4861,7 @@
         <w:rPr>
           <w:rFonts w:eastAsia="SimSun"/>
         </w:rPr>
-        <w:t xml:space="preserve"> 失败。在已部署适配器上保留链校验与 AIC 绑定、去掉主机名校验之后，这条路径即可打通。在 30 组同意试验与 10 组重复投递试验合计 40 组中，有 36 组的首位候选是受测 Partner；用户同意之前没有任何一组触达过 Partner（0/40），而这 36 次同意每一次都恰好产生一次调用和一条 Partner 动作记录。其余 4 组的首位候选是研究集合之外的公共注册中心智能体，因此没有触达任何受测 Partner。副作用日志共 39 条：上述 36 条动作，加上两个阶段开跑前各一次的试运行探测，以及一次手动连通性探测；日志中没有任何 task id 重复，因此不存在重试。20 次重复投递的同意事件没有产生任何新增动作，并返回了完全相同的缓存回复。也就是说，同意是调用的必要条件，而一个事件 ID 只产生一次 Partner 侧动作。URI-SAN 身份模型与基于主机名的传输校验必须相互对齐。</w:t>
+        <w:t xml:space="preserve"> 失败。在已部署适配器上保留链校验与 AIC 绑定、去掉主机名校验之后，这条路径即可打通。在 30 组同意试验与 10 组重复投递试验合计 40 组中，有 36 组的首位候选是受测 Partner；用户同意之前没有任何一组触达过 Partner（0/40），而这 36 次同意每一次都恰好产生一次调用和一条 Partner 动作记录。其余 4 组的首位候选是研究集合之外的公共注册中心智能体，因此没有触达任何受测 Partner。副作用日志共 39 条：上述 36 条动作，加上两个阶段开跑前各一次的试运行探测，以及一次手动连通性探测；日志中没有任何 task id 重复，因此不存在重试。20 次重复投递的同意事件没有产生任何新增动作，并返回了完全相同的缓存回复。URI-SAN 身份模型与基于主机名的传输校验必须相互对齐。</w:t>
       </w:r>
     </w:p>
     <w:p>
@@ -5423,7 +5423,7 @@
         <w:color w:val="5A5A5A"/>
         <w:sz w:val="16"/>
       </w:rPr>
-      <w:t>中文初稿 | 仅为仿真器试点</w:t>
+      <w:t>中文参考稿，供阅读使用</w:t>
     </w:r>
   </w:p>
 </w:ftr>

</xml_diff>